<commit_message>
script/paper: explain McNemar in plain words, soften wording, add figure plan
- 발표대본: §7 gains a three-sentence plain-language McNemar explanation
  (same 268 images, 7 discordant: 6 vs 1, so a real difference cannot be claimed);
  §10 points at the same test by name
- wording softened: 완전히 / 필수 / 절대 removed where they were rhetorical
  (technical terms such as "절대적 유사도" kept)
- outline Figure 3 caption now says Test Set (validation ROC panel dropped)
- revision3/figure_plan.md: keep / regenerate / drop / add list for figures

Discord: https://discord.com/channels/1558830378104529049/1563001479311138826
</commit_message>
<xml_diff>
--- a/paper_submission/revision3/manuscript_v3_marked.docx
+++ b/paper_submission/revision3/manuscript_v3_marked.docx
@@ -200,7 +200,7 @@
           <w:color w:val="DC1414"/>
           <w:sz w:val="20"/>
         </w:rPr>
-        <w:t>정제된 단일기관 내부 검증 세트에서 높은 변별력을 나타내었으나, 본 연구는 배경 간 질환에 따른 층화 분석과 외부 독립 검증이 결여되어 일반화에 한계가 있다. 향후 다양한 기관 및 장비 환경에서의 전향적 외부 검증이 필수적이다.</w:t>
+        <w:t>정제된 단일기관 내부 검증 세트에서 높은 변별력을 나타내었으나, 본 연구는 배경 간 질환에 따른 층화 분석과 외부 독립 검증이 결여되어 일반화에 한계가 있다. 향후 다양한 기관 및 장비 환경에서의 전향적 외부 검증이 필요하다.</w:t>
       </w:r>
     </w:p>
     <w:p>
@@ -591,7 +591,7 @@
           <w:color w:val="DC1414"/>
           <w:sz w:val="20"/>
         </w:rPr>
-        <w:t xml:space="preserve">주력 모델에서 산출된 confidence score(ROC-A), HCC cosine score(ROC-B), Δscore(ROC-C)의 변별력을 비교하였다(Table 4). 세 출력의 AUROC는 모두 1.000으로 ROC 곡선이 완전히 중첩되어 변별력의 차이를 추정할 수 없었고, 따라서 비열등성은 성립하지 않는다. 운영점 수준의 비교는 Table 3·3B와 McNemar exact test로 제시하였다. </w:t>
+        <w:t xml:space="preserve">주력 모델에서 산출된 confidence score(ROC-A), HCC cosine score(ROC-B), Δscore(ROC-C)의 변별력을 비교하였다(Table 4). 세 출력의 AUROC는 모두 1.000으로 ROC 곡선이 겹쳐 변별력의 차이를 추정할 수 없었고, 따라서 비열등성은 성립하지 않는다. 운영점 수준의 비교는 Table 3·3B와 McNemar exact test로 제시하였다. </w:t>
       </w:r>
       <w:r>
         <w:rPr>
@@ -747,7 +747,7 @@
           <w:color w:val="DC1414"/>
           <w:sz w:val="20"/>
         </w:rPr>
-        <w:t>둘째, 실제 간암 감시 환경에서 흔히 접하는 만성 B형·C형 간염, 간경변증, 그리고 거친 지방간 등 다양한 배경 간 실질 에코 환경에 따른 층화 분석을 수행하지 못하였다. 공개 데이터셋 메타데이터에 배경 간 질환 정보가 포함되어 있지 않아, 딥러닝 모델이 병변 자체의 내부 에코 특성뿐만 아니라 간세포암이 호발하는 거친 간경변 배경 실질이나 혈관종이 호발하는 정상 간 실질의 배경 음영을 일종의 단축 경로(shortcut feature)로 학습했을 가능성을 완전히 배제할 수 없다.</w:t>
+        <w:t>둘째, 실제 간암 감시 환경에서 흔히 접하는 만성 B형·C형 간염, 간경변증, 그리고 거친 지방간 등 다양한 배경 간 실질 에코 환경에 따른 층화 분석을 수행하지 못하였다. 공개 데이터셋 메타데이터에 배경 간 질환 정보가 포함되어 있지 않아, 딥러닝 모델이 병변 자체의 내부 에코 특성뿐만 아니라 간세포암이 호발하는 거친 간경변 배경 실질이나 혈관종이 호발하는 정상 간 실질의 배경 음영을 일종의 단축 경로(shortcut feature)로 학습했을 가능성을 배제하기 어렵다.</w:t>
       </w:r>
     </w:p>
     <w:p>

</xml_diff>

<commit_message>
revision3: fix HIGH/MED review findings, cite Table 4B once
HIGH
- methods 2.5: CI method now Wilson, matching Table 3/3B values (was Clopper-Pearson)
- Figure 1 cited in 3.3 (train+val t-SNE), Figure 3 cited in 3.4 (ROC)
- Table 4B cited in one sentence in 3.4 (ceiling across 6 models; SSL exception)
- abstract conclusion and discussion opening no longer report validation performance

MED
- 3.2 ablation framed as validation model selection, numbers moved to Table 2
- abstract no longer cites Table 3/3B; table citation order now 1, 1B, 2, 3, 3B, 4, 4B
- "동등 이상" removed; non-inferiority stated as not assessable
- Figure 1 caption aligned in outline (train+val, mean vs k-means panels)
- 0.50 used for the operating point throughout the manuscript
- Delta score kept at introduction level: margin arithmetic removed, one summary sentence
- abstract numbers reduced (no n, no p-value); distribution paragraph trimmed

Discord: https://discord.com/channels/1558830378104529049/1563001479311138826
</commit_message>
<xml_diff>
--- a/paper_submission/revision3/manuscript_v3_marked.docx
+++ b/paper_submission/revision3/manuscript_v3_marked.docx
@@ -106,7 +106,7 @@
           <w:color w:val="DC1414"/>
           <w:sz w:val="20"/>
         </w:rPr>
-        <w:t xml:space="preserve"> 주 분석의 운영점은 관행값 0.5로 미리 정하고, 닮음 지표의 임계값은 검증 세트에서만 Youden's J로 결정해 테스트 세트에 고정한 탐색적 분석으로 제시하였다(Table 3, Table 3B).</w:t>
+        <w:t xml:space="preserve"> 주 분석의 운영점은 관행값 0.50으로 미리 정하고, 닮음 지표의 임계값은 검증 세트에서만 Youden's J로 결정해 테스트 세트에 고정한 탐색적 분석으로 제시하였다.</w:t>
       </w:r>
     </w:p>
     <w:p>
@@ -141,7 +141,7 @@
           <w:color w:val="DC1414"/>
           <w:sz w:val="20"/>
         </w:rPr>
-        <w:t xml:space="preserve">이는 천장 효과로, 변별력의 차이를 추정할 수 없었다. 확률 0.5 운영점과 닮음 지표 운영점은 서로 다른 증례에서 실패했으나 두 운영점 간 판정 차이는 유의하지 않았고, 우월성과 비열등성 어느 쪽도 주장하지 않는다(Table 3, Table 3B). </w:t>
+        <w:t xml:space="preserve">이는 천장 효과로, 변별력의 차이를 추정할 수 없었다. 확률 0.50 운영점과 닮음 지표 운영점은 서로 다른 증례에서 실패했으나 두 운영점 간 판정 차이는 유의하지 않았고, 우월성과 비열등성 어느 쪽도 주장하지 않는다. </w:t>
       </w:r>
       <w:r>
         <w:rPr>
@@ -149,7 +149,7 @@
           <w:color w:val="DC1414"/>
           <w:sz w:val="20"/>
         </w:rPr>
-        <w:t xml:space="preserve">닮음 지표 운영점에서는 HCC cosine score와 Δscore가 동일한 증례에서 위양성을 보였으며, 그 증례는 확률 0.5 운영점에서는 정답으로 분류되었다. </w:t>
+        <w:t xml:space="preserve">닮음 지표 운영점에서는 HCC cosine score와 Δscore가 동일한 증례에서 위양성을 보였으며, 그 증례는 확률 0.50 운영점에서는 정답으로 분류되었다. </w:t>
       </w:r>
       <w:r>
         <w:rPr>
@@ -157,7 +157,7 @@
           <w:color w:val="DC1414"/>
           <w:sz w:val="20"/>
         </w:rPr>
-        <w:t xml:space="preserve">미학습 실제 영상(Val+Test) 대상 대응표본 비교에서, SupCon 적용 시 실제 HCC(n=417)와 실제 혈관종(n=381) 영상 모두에서 각 클래스의 cosine score 분포가 상향 이동하고 분산이 감소하였다(모두 p &lt; 0.001). </w:t>
+        <w:t xml:space="preserve">미학습 실제 영상 대상 대응표본 비교에서는 SupCon 적용 후 두 클래스 모두에서 cosine score 분포가 상향 이동하고 분산이 감소하였다. </w:t>
       </w:r>
       <w:r>
         <w:rPr>
@@ -192,7 +192,7 @@
           <w:color w:val="DC1414"/>
           <w:sz w:val="20"/>
         </w:rPr>
-        <w:t xml:space="preserve">본 연구는 B-mode 초음파에서 B-mode 영상 소견 기반 간세포암과 혈관종 감별을 보조하는 이중 출력 지표(confidence score, HCC cosine score, Δscore)의 산출 가능성을 탐색하였다. </w:t>
+        <w:t xml:space="preserve">본 연구는 B-mode 초음파 영상 소견을 기반으로 간세포암과 혈관종 감별을 보조하는 이중 출력 지표(confidence score, HCC cosine score, Δscore)의 산출 가능성을 탐색하였다. </w:t>
       </w:r>
       <w:r>
         <w:rPr>
@@ -200,7 +200,7 @@
           <w:color w:val="DC1414"/>
           <w:sz w:val="20"/>
         </w:rPr>
-        <w:t>정제된 단일기관 내부 검증 세트에서 높은 변별력을 나타내었으나, 본 연구는 배경 간 질환에 따른 층화 분석과 외부 독립 검증이 결여되어 일반화에 한계가 있다. 향후 다양한 기관 및 장비 환경에서의 전향적 외부 검증이 필요하다.</w:t>
+        <w:t>정제된 단일기관 테스트 세트에서 높은 변별력을 나타내었으나, 본 연구는 배경 간 질환에 따른 층화 분석과 외부 독립 검증이 결여되어 일반화에 한계가 있다. 향후 다양한 기관 및 장비 환경에서의 전향적 외부 검증이 필요하다.</w:t>
       </w:r>
     </w:p>
     <w:p>
@@ -355,7 +355,7 @@
           <w:color w:val="DC1414"/>
           <w:sz w:val="20"/>
         </w:rPr>
-        <w:t xml:space="preserve">원저에서 동일 환자의 영상이 세트 간에 중복되지 않도록 환자 단위(patient-level)로 분할하여 공개한 분할 기준(70:20:10)을 그대로 준용하여 훈련 세트 1,858장(HCC 972장, 혈관종 886장), 검증 세트 530장(HCC 277장, 혈관종 253장), 테스트 세트 268장(HCC 140장, 혈관종 128장)으로 구성하였다(Table 1B). 다만 744명의 환자로부터 2,656장의 영상이 수집되어 환자 대 영상 비율이 1:1 매칭은 아니며(환자당 평균 3.57장), 공개 데이터셋 특성상 영상 파일 수준에서 환자 식별자가 직접 연동되어 제공되지 않아 본 연구팀이 환자 간 영상 비교차를 직접 교차 검증하지는 못하고 원저의 분할 구성을 그대로 따랐다. </w:t>
+        <w:t xml:space="preserve">원저에서 동일 환자의 영상이 세트 간에 중복되지 않도록 환자 단위(patient-level)로 분할하여 공개한 분할 기준(70:20:10)을 그대로 준용하여 훈련 세트 1,858장(HCC 972장, 혈관종 886장), 검증 세트 530장(HCC 277장, 혈관종 253장), 테스트 세트 268장(HCC 140장, 혈관종 128장)으로 구성하였다. 다만 744명의 환자로부터 2,656장의 영상이 수집되어 환자 대 영상 비율이 1:1 매칭은 아니며(환자당 평균 3.57장), 공개 데이터셋 특성상 영상 파일 수준에서 환자 식별자가 직접 연동되어 제공되지 않아 본 연구팀이 환자 간 영상 비교차를 직접 교차 검증하지는 못하고 원저의 분할 구성을 그대로 따랐다. </w:t>
       </w:r>
       <w:r>
         <w:rPr>
@@ -434,7 +434,7 @@
           <w:color w:val="DC1414"/>
           <w:sz w:val="20"/>
         </w:rPr>
-        <w:t xml:space="preserve">주 분석의 이진 분류 운영 임계값(operational cutoff)은 관행적인 확률값 0.5로 미리 정하였다. 검증 세트에서 Youden's J로 임계값을 고르면, 이 코호트의 AUROC가 천장(1.000)에 닿아 최적값이 유일하게 정해지지 않고 사실상 '항상 HCC'에 가까운 값이 선택되기 때문이다. </w:t>
+        <w:t xml:space="preserve">주 분석의 이진 분류 운영 임계값(operational cutoff)은 관행적인 확률값 0.50으로 미리 정하였다. 검증 세트에서 Youden's J로 임계값을 고르면, 이 코호트의 AUROC가 천장(1.000)에 닿아 최적값이 유일하게 정해지지 않고 사실상 '항상 HCC'에 가까운 값이 선택되기 때문이다. </w:t>
       </w:r>
       <w:r>
         <w:rPr>
@@ -442,7 +442,7 @@
           <w:color w:val="DC1414"/>
           <w:sz w:val="20"/>
         </w:rPr>
-        <w:t xml:space="preserve">닮음 지표(HCC cosine score, Δscore)의 임계값은 검증 세트에서만 Youden's J로 결정해 테스트 세트에 변경 없이 적용하였으며, 천장 효과 때문에 최적값이 유일하지 않으므로 같은 성능을 내는 등가 구간(equivalence interval)과 함께 보고한다(Table 3B). 이 값들은 유도 코호트에 종속되므로 외부 코호트에서 재산출하기 전에는 이전(transport)할 수 없다. 모델의 변별력은 AUROC로 평가하였으며, </w:t>
+        <w:t xml:space="preserve">닮음 지표(HCC cosine score, Δscore)의 임계값은 검증 세트에서만 Youden's J로 결정해 테스트 세트에 변경 없이 적용하였으며, 천장 효과 때문에 최적값이 유일하지 않으므로 같은 성능을 내는 등가 구간(equivalence interval)과 함께 보고한다(등가 구간은 결과 3.3에 제시). 이 값들은 유도 코호트에 종속되므로 외부 코호트에서 재산출하기 전에는 이전(transport)할 수 없다. 모델의 변별력은 AUROC로 평가하였으며, </w:t>
       </w:r>
       <w:r>
         <w:rPr>
@@ -450,7 +450,7 @@
           <w:color w:val="DC1414"/>
           <w:sz w:val="20"/>
         </w:rPr>
-        <w:t xml:space="preserve">이진 분류 지표(민감도, 특이도, 양성예측도, 음성예측도, 정확도, F1 점수)에 대해서는 Clopper-Pearson 정확 이항 분포(exact binomial) 95% 신뢰구간(CI)을 산출하였다. </w:t>
+        <w:t xml:space="preserve">민감도·특이도·정확도에는 Wilson score 방식의 95% 신뢰구간(CI)을 산출하였고, 양성예측도·음성예측도·F1 점수는 점추정값으로 제시하였다. </w:t>
       </w:r>
       <w:r>
         <w:rPr>
@@ -526,10 +526,10 @@
       <w:r>
         <w:rPr>
           <w:rFonts w:ascii="Malgun Gothic" w:hAnsi="Malgun Gothic"/>
-          <w:color w:val="141414"/>
+          <w:color w:val="DC1414"/>
           <w:sz w:val="20"/>
         </w:rPr>
-        <w:t xml:space="preserve">검증 세트(n=530)에서 백본 및 학습 방식에 따른 분류 성능 비교 결과는 Table 2와 같다. 주력 모델인 EfficientNetV2B0 + CE+SupCon(#4)은 검증 세트에서 AUROC 1.000, </w:t>
+        <w:t xml:space="preserve">백본 및 학습 방식에 따른 비교는 모델 선택을 위한 검증 세트(n=530) 분석이며, 성능 값은 Table 2에 정리하였다. 주력 모델인 EfficientNetV2B0 + CE+SupCon(#4)은 검증 세트에서 세 출력 모두 천장에 도달하였다. </w:t>
       </w:r>
       <w:r>
         <w:rPr>
@@ -537,15 +537,7 @@
           <w:color w:val="DC1414"/>
           <w:sz w:val="20"/>
         </w:rPr>
-        <w:t xml:space="preserve">민감도 100.0%, 특이도 100.0%, F1 점수 1.000을 달성하여 </w:t>
-      </w:r>
-      <w:r>
-        <w:rPr>
-          <w:rFonts w:ascii="Malgun Gothic" w:hAnsi="Malgun Gothic"/>
-          <w:color w:val="141414"/>
-          <w:sz w:val="20"/>
-        </w:rPr>
-        <w:t>ResNet50V2 + CE+SupCon(#3, AUROC 1.000, 민감도 99.64%, 특이도 100.0%) 대비 동등 이상의 분류 성능을 보다 경량화된 파라미터(7.1M vs 23.6M)로 구현하였다. 반면 자기지도학습을 결합한 2단계 학습(NNCLR) 조건(#5, #6)은 CE+SupCon 단독 학습 대비 검증 세트 분류 성능이 오히려 소폭 저하되었다(EfficientNet NNCLR: AUROC 0.9986, 민감도 98.19%, 특이도 98.42%).</w:t>
+        <w:t>ResNet50V2 + CE+SupCon(#3)도 비슷한 수준이었으나, 주력 모델은 그보다 적은 파라미터(7.1M vs 23.6M)로 같은 수준의 검증 성능을 보였다. 반면 자기지도학습을 결합한 2단계 학습(NNCLR) 조건(#5, #6)은 CE+SupCon 단독 학습보다 검증 세트에서 오히려 낮은 성능을 보였다. 이 비교는 운영점 성능이 아니라 모델 선택을 위한 것이므로, 테스트 세트 성능과 혼동하지 않도록 Table 2 각주에 밝혔다.</w:t>
       </w:r>
       <w:r>
         <w:rPr>
@@ -564,7 +556,7 @@
           <w:color w:val="DC1414"/>
           <w:sz w:val="20"/>
         </w:rPr>
-        <w:t xml:space="preserve">주력 모델의 분류 성능은 두 운영점으로 나누어 Table 3(확률 0.5, 주 분석)과 Table 3B(닮음 지표, 탐색적)에 제시하였다. </w:t>
+        <w:t xml:space="preserve">임베딩 공간에서 두 클래스가 분리되는지 확인하기 위해 훈련·검증 세트 임베딩의 t-SNE 시각화를 제시하였다(Figure 1). 이어서 주력 모델의 분류 성능은 두 운영점으로 나누어 Table 3(확률 0.50, 주 분석)과 Table 3B(닮음 지표, 탐색적)에 제시하였다. </w:t>
       </w:r>
       <w:r>
         <w:rPr>
@@ -572,7 +564,7 @@
           <w:color w:val="DC1414"/>
           <w:sz w:val="20"/>
         </w:rPr>
-        <w:t>확률 0.5 운영점에서는 위음성이, 닮음 지표 운영점에서는 위양성이 각각 발생했고 두 오류 집합은 겹치지 않았다(Table 3, Table 3B; Figure 2).</w:t>
+        <w:t>확률 0.50 운영점에서는 위음성이, 닮음 지표 운영점에서는 위양성이 각각 발생했고 두 오류 집합은 겹치지 않았다(Table 3, Table 3B; Figure 2).</w:t>
       </w:r>
       <w:r>
         <w:rPr>
@@ -591,7 +583,7 @@
           <w:color w:val="DC1414"/>
           <w:sz w:val="20"/>
         </w:rPr>
-        <w:t xml:space="preserve">주력 모델에서 산출된 confidence score(ROC-A), HCC cosine score(ROC-B), Δscore(ROC-C)의 변별력을 비교하였다(Table 4). 세 출력의 AUROC는 모두 1.000으로 ROC 곡선이 겹쳐 변별력의 차이를 추정할 수 없었고, 따라서 비열등성은 성립하지 않는다. 운영점 수준의 비교는 Table 3·3B와 McNemar exact test로 제시하였다. </w:t>
+        <w:t xml:space="preserve">주력 모델에서 산출된 confidence score(ROC-A), HCC cosine score(ROC-B), Δscore(ROC-C)의 변별력을 비교하였다(Table 4, Figure 3). 세 출력의 AUROC는 모두 1.000으로 ROC 곡선이 겹쳐 변별력의 차이를 추정할 수 없었고, 이 조건에서는 비열등성을 판정할 수 없다. 운영점 수준의 비교는 Table 3·3B와 McNemar exact test로 제시하였다. 학습 방식과 백본을 달리한 6개 모델에서도 AUROC는 대체로 천장에 도달하였고, 자기지도학습 조합에서 닮음 지표의 AUROC가 0.5 아래로 내려간 예외가 관찰되었다(Table 4B). </w:t>
       </w:r>
       <w:r>
         <w:rPr>
@@ -634,7 +626,7 @@
           <w:color w:val="DC1414"/>
           <w:sz w:val="20"/>
         </w:rPr>
-        <w:t>점수 상승의 분포 내 위치를 확인한 결과, 실제 HCC 영상 417예 중 395예(94.7%)에서 HCC cosine score가 상승하였고, 하위 10백분위수는 0.489에서 0.762로, 최솟값은 −0.472에서 −0.005로 상승한 반면 상위 10백분위수는 0.951에서 0.985로 변화폭이 작았다. 즉 분산 감소는 프로토타입에 이미 가까웠던 증례보다 멀리 위치하였던 증례의 점수 상승에 주로 기인하였다(초기 점수와 상승폭의 상관 r=−0.80).</w:t>
+        <w:t>실제 HCC 영상의 94.7%(395/417)에서 점수가 상승하였고, 상승 폭은 프로토타입에서 멀리 있던 증례이서 컸다(초기 점수와 상승폭의 상관 r=−0.80). 즉 분산 감소는 이미 프로토타입에 가까웠던 증례보다 멀리 위치하였던 증례의 상승에 주로 기인하였다.</w:t>
       </w:r>
     </w:p>
     <w:p>
@@ -647,7 +639,7 @@
           <w:color w:val="DC1414"/>
           <w:sz w:val="20"/>
         </w:rPr>
-        <w:t>한편 동일한 대응 비교에서 각 클래스는 자신의 프로토타입뿐 아니라 상대 클래스 프로토타입 방향으로도 이동하였다. 실제 HCC 영상의 hemangioma cosine score 중앙값은 −0.631에서 −0.108로, 실제 혈관종 영상의 HCC cosine score 중앙값은 −0.701에서 −0.226으로 각각 상승하였으며, Δscore의 클래스 간 중앙값 간격은 3.163에서 2.289로 27.6% 감소하였다. 이는 3.4절에서 관찰된 Δscore 중앙값의 감소와 일치하는 소견이다.</w:t>
+        <w:t>한편 동일한 대응 비교에서 각 클래스는 자신의 프로토타입 방향으로 이동하는 동시에 상대 클래스 프로토타입 방향으로도 일부 이동하였다. 이는 코사인 점수가 클래스와의 절대적 거리보다 상대적 위치를 반영한다는 점을 시사한다. Δscore는 두 점수의 차이로 정의되는 보조 지표로만 소개하며, 본 연구의 논지는 HCC cosine score에 둔다.</w:t>
       </w:r>
     </w:p>
     <w:p>
@@ -674,7 +666,7 @@
           <w:color w:val="141414"/>
           <w:sz w:val="20"/>
         </w:rPr>
-        <w:t>본 연구는 B-mode 복부 초음파 영상에서 간세포암과 간혈관종을 감별하기 위해 EfficientNetV2B0 기반 hybrid vision transformer를 구축하고, 전통적인 단일 소프트맥스 confidence score 외에 임베딩 공간의 프로토타입 거리에 기반한 연속형 유사도 점수(HCC cosine score 및 Δscore)를 함께 산출하는 이중 출력 프레임워크를 탐색적으로 제안하였다. 제안 모델은 검증·테스트 세트 모두에서 AUROC 1.000의 변별력을 보였으며, 운영점에 따른 분류 성능은 Table 3·3B에 제시하였다.</w:t>
+        <w:t>본 연구는 B-mode 복부 초음파 영상에서 간세포암과 간혈관종을 감별하기 위해 EfficientNetV2B0 기반 hybrid vision transformer를 구축하고, 전통적인 단일 소프트맥스 confidence score 외에 임베딩 공간의 프로토타입 거리에 기반한 연속형 유사도 점수(HCC cosine score 및 Δscore)를 함께 산출하는 이중 출력 프레임워크를 탐색적으로 제안하였다. 제안 모델은 테스트 세트에서 AUROC 1.000의 변별력을 보였으며, 운영점에 따른 분류 성능은 Table 3·3B에 제시하였다.</w:t>
       </w:r>
     </w:p>
     <w:p>
@@ -721,7 +713,7 @@
           <w:color w:val="DC1414"/>
           <w:sz w:val="20"/>
         </w:rPr>
-        <w:t>이와 함께, 본 연구에서 관찰된 코사인 점수의 상향 이동과 분산 감소는 SupCon 목적함수(클래스 내 응집)가 충족된 결과라는 점에서 임상적 타당성의 독립적인 증거로 해석할 수 없다. 실제로 동일한 분석에서 두 클래스 간 간격은 3.163에서 2.289로 축소되어, 코사인 점수의 해석 가능성은 향상된 반면 Δscore가 나타내는 상대적 판별 마진은 감소하였다. 따라서 본 연구에서는 SupCon의 효과를 분류 성능의 향상이 아니라 표상 기하(representation geometry)의 변화로 한정하여 보고한다.</w:t>
+        <w:t>이와 함께, 본 연구에서 관찰된 코사인 점수의 상향 이동과 분산 감소는 SupCon 목적함수(클래스 내 응집)가 충족된 결과라는 점에서 임상적 타당성의 독립적인 증거로 해석할 수 없다. 실제로 동일한 분석에서 두 클래스 간 간격은 오히려 축소되는 경향이 관찰되어, 코사인 점수의 해석 가능성과 판별 마진이 같은 방향으로 움직이지는 않았다. 따라서 본 연구에서는 SupCon의 효과를 분류 성능의 향상이 아니라 표상 기하(representation geometry)의 변화로 한정하여 보고한다.</w:t>
       </w:r>
     </w:p>
     <w:p>
@@ -734,7 +726,7 @@
           <w:color w:val="DC1414"/>
           <w:sz w:val="20"/>
         </w:rPr>
-        <w:t>그러나 본 연구의 결과는 다음과 같은 중대한 임상적·방법론적 제한점의 맥락에서 매우 신중하게 해석되어야 한다. 첫째, 본 연구의 과제는 무증상 고위험군을 대상으로 미세 병변을 조기에 찾아내는 '간암 감시(surveillance) 또는 선별 검사'가 아니라, 이미 초음파상에서 명확히 발견된 결절에 대한 '간세포암과 혈관종 간의 2진 감별 진단'에 국한된다. 더욱이 원 데이터셋(SMC-LUD)에서 간세포암은 수술이나 생검으로 확진된 반면 간혈관종은 영상의학적 판독 소견으로 진단되었고, HCC 병변의 직경 중앙값도 2.90 cm로 비교적 컸다. 이러한 참조표준(reference standard)의 비대칭성과 전형적 증례 중심의 선정 과정은 불가피하게 스펙트럼 편향(spectrum bias) 및 선택 편향(selection bias)을 수반하며, 내부 검증 세트에서 관찰된 매우 높은 정확도는 이러한 이상적인 데이터 정제 환경이 반영된 결과일 가능성이 높다.</w:t>
+        <w:t>그러나 본 연구의 결과는 다음과 같은 중대한 임상적·방법론적 제한점의 맥락에서 매우 신중하게 해석되어야 한다. 첫째, 본 연구의 과제는 무증상 고위험군을 대상으로 미세 병변을 조기에 찾아내는 '간암 감시(surveillance) 또는 선별 검사'가 아니라, 이미 초음파상에서 명확히 발견된 결절에 대한 '간세포암과 혈관종 간의 2진 감별 진단'에 국한된다. 더욱이 원 데이터셋(SMC-LUD)에서 간세포암은 수술이나 생검으로 확진된 반면 간혈관종은 영상의학적 판독 소견으로 진단되었고, HCC 병변의 직경 중앙값도 2.90 cm로 비교적 컸다. 이러한 참조표준(reference standard)의 비대칭성과 전형적 증례 중심의 선정 과정은 불가피하게 스펙트럼 편향(spectrum bias) 및 선택 편향(selection bias)을 수반하며, 본 데이터셋에서 관찰된 높은 정확도는 이러한 이상적인 데이터 정제 환경이 반영된 결과일 가능성이 높다.</w:t>
       </w:r>
     </w:p>
     <w:p>
@@ -786,7 +778,7 @@
           <w:color w:val="DC1414"/>
           <w:sz w:val="20"/>
         </w:rPr>
-        <w:t>다섯째, 세 출력이 모두 AUROC 1.000에 도달하는 천장 효과(ceiling effect)로 인해 변별력의 차이를 추정할 수 없었고, 이 코호트에서 최적 임계값 역시 유일하게 정해지지 않는다. 따라서 본 연구는 임계값을 한 점이 아니라 등가 구간과 함께 보고하였으며(Table 3B), 관행값 0.5와 닮음 지표 운영점 사이의 판정 차이도 통계적으로 유의하지 않았다(McNemar exact test). 두 운영점은 서로 다른 증례에서 실패했으므로, 유사도 점수의 독자적 기여는 이 데이터만으로 판정할 수 없고 외부 코호트에서 임계값을 재산출한 뒤 평가해야 한다.</w:t>
+        <w:t>다섯째, 세 출력이 모두 AUROC 1.000에 도달하는 천장 효과(ceiling effect)로 인해 변별력의 차이를 추정할 수 없었고, 이 코호트에서 최적 임계값 역시 유일하게 정해지지 않는다. 따라서 본 연구는 임계값을 한 점이 아니라 등가 구간과 함께 보고하였으며(Table 3B), 관행값 0.50과 닮음 지표 운영점 사이의 판정 차이도 통계적으로 유의하지 않았다(McNemar exact test). 두 운영점은 서로 다른 증례에서 실패했으므로, 유사도 점수의 독자적 기여는 이 데이터만으로 판정할 수 없고 외부 코호트에서 임계값을 재산출한 뒤 평가해야 한다.</w:t>
       </w:r>
     </w:p>
     <w:p>

</xml_diff>

<commit_message>
intervals are validation-derived and contain their cutoff; add figures_v3.docx
- cutoffs and equivalence intervals both come from the validation set, so each
  cutoff sits inside its own interval by construction: confidence 0.50 in
  (0.4498, 0.5400], HCC cosine -0.004843 at the upper bound (-0.0498, -0.0048],
  Delta score -0.958471 at (-1.0001, -0.9585]
- the upper bound is set by the single lowest-scoring HCC case in validation;
  the test false positive is the highest-scoring test hemangioma (+0.0325)
  rising above that cutoff
- deck slide 7 table shows cutoff + validation interval only (three columns);
  slide 11, script section 7, manuscript methods/results, Table 3/3B footnotes,
  README and the web demo follow the same definition
- new figures_v3.docx: five figures with captions, 7 images, one per page;
  captions moved to captions_v3.py shared by tables_v3.docx and figures_v3.docx

Discord: https://discord.com/channels/1558830378104529049/1563001479311138826
</commit_message>
<xml_diff>
--- a/paper_submission/revision3/manuscript_v3_marked.docx
+++ b/paper_submission/revision3/manuscript_v3_marked.docx
@@ -442,7 +442,7 @@
           <w:color w:val="DC1414"/>
           <w:sz w:val="20"/>
         </w:rPr>
-        <w:t xml:space="preserve">닮음 지표(HCC cosine score, Δscore)의 임계값은 검증 세트에서만 Youden's J로 결정해 테스트 세트에 변경 없이 적용하였으며, 천장 효과 때문에 최적값이 유일하지 않으므로, 테스트 오류가 0이 되는 임계값 범위(등가 구간, equivalence interval)를 함께 보고한다(등가 구간은 결과 3.3에 제시). 이 값들은 유도 코호트에 종속되므로 외부 코호트에서 재산출하기 전에는 이전(transport)할 수 없다. 모델의 변별력은 AUROC로 평가하였으며, </w:t>
+        <w:t xml:space="preserve">닮음 지표(HCC cosine score, Δscore)의 임계값은 검증 세트에서만 Youden's J로 결정해 테스트 세트에 변경 없이 적용하였으며, 천장 효과 때문에 최적값이 유일하지 않으므로, 같은 혼동행렬을 내는 검증 세트의 임계값 범위(등가 구간, equivalence interval)를 함께 보고한다(등가 구간은 결과 3.3에 제시). 이 값들은 유도 코호트에 종속되므로 외부 코호트에서 재산출하기 전에는 이전(transport)할 수 없다. 모델의 변별력은 AUROC로 평가하였으며, </w:t>
       </w:r>
       <w:r>
         <w:rPr>
@@ -564,7 +564,7 @@
           <w:color w:val="DC1414"/>
           <w:sz w:val="20"/>
         </w:rPr>
-        <w:t>확률 0.50 운영점에서는 위음성이, 닮음 지표 운영점에서는 위양성이 각각 발생했고 두 오류 집합은 겹치지 않았다(Table 3, Table 3B; Figure 2). 테스트 오류가 0이 되는 임계값 범위(등가 구간)는 세 지표 모두 넓게 나타났으며, 관행값 0.50과 검증 세트에서 고른 두 닮음 임계값은 모두 이 범위 밖이었다. 이는 AUROC가 천장에 닿고 테스트 세트가 268장으로 작은 데 따른 것으로, 임계값의 위치는 이 표본에 종속된다.</w:t>
+        <w:t>확률 0.50 운영점에서는 위음성이, 닮음 지표 운영점에서는 위양성이 각각 발생했고 두 오류 집합은 겹치지 않았다(Table 3, Table 3B; Figure 2). 세 임계값과 그 등가 구간은 모두 검증 세트에서 산출되었으며, 확률 0.50과 두 닮음 임계값은 각자의 등가 구간 안에 위치하였다(Table 3B). 닮음 지표에서는 구간의 위쪽 경계가 곧 임계값이었는데, 이는 검증 세트에서 가장 낮은 점수를 보인 HCC 한 증례가 경계를 정한 결과이다. 테스트에서는 이 값을 변경 없이 적용하였다.</w:t>
       </w:r>
       <w:r>
         <w:rPr>

</xml_diff>

<commit_message>
review pass: fix README interval column, slide 4 spacing, add McNemar p
- README exploratory table used the old test-derived intervals; now the
  validation equivalence intervals, matching the tables
- slide 4 footnote sat on the footer rule; spacing reduced so it clears
- manuscript results state the McNemar p once (6 vs 1, p = 0.125)
- manuscript wording: "절대적 거리" rephrased (house style avoids absolutes)
- script header character count recomputed for sections 1-12 (3,603)
- rebuilt deck HTML/PDF, docs/talk page, manuscript/tables/figures docx

Discord: https://discord.com/channels/1558830378104529049/1563001479311138826
</commit_message>
<xml_diff>
--- a/paper_submission/revision3/manuscript_v3_marked.docx
+++ b/paper_submission/revision3/manuscript_v3_marked.docx
@@ -583,7 +583,7 @@
           <w:color w:val="DC1414"/>
           <w:sz w:val="20"/>
         </w:rPr>
-        <w:t xml:space="preserve">주력 모델에서 산출된 confidence score(ROC-A), HCC cosine score(ROC-B), Δscore(ROC-C)의 변별력을 비교하였다(Table 4, Figure 3). 세 출력의 AUROC는 모두 1.000으로 ROC 곡선이 겹쳐 변별력의 차이를 추정할 수 없었고, 이 조건에서는 비열등성을 판정할 수 없다. 운영점 수준의 비교는 Table 3·3B와 McNemar exact test로 제시하였다. 학습 방식과 백본을 달리한 6개 모델에서도 AUROC는 대체로 천장에 도달하였고, 자기지도학습 조합에서 닮음 지표의 AUROC가 0.5 아래로 내려간 예외가 관찰되었다(Table 4B). </w:t>
+        <w:t xml:space="preserve">주력 모델에서 산출된 confidence score(ROC-A), HCC cosine score(ROC-B), Δscore(ROC-C)의 변별력을 비교하였다(Table 4, Figure 3). 세 출력의 AUROC는 모두 1.000으로 ROC 곡선이 겹쳐 변별력의 차이를 추정할 수 없었고, 이 조건에서는 비열등성을 판정할 수 없다. 운영점 수준의 비교는 Table 3·3B와 McNemar exact test로 제시하였으며, 불일치 6건 대 1건으로 p = 0.125였다. 학습 방식과 백본을 달리한 6개 모델에서도 AUROC는 대체로 천장에 도달하였고, 자기지도학습 조합에서 닮음 지표의 AUROC가 0.5 아래로 내려간 예외가 관찰되었다(Table 4B). </w:t>
       </w:r>
       <w:r>
         <w:rPr>
@@ -639,7 +639,7 @@
           <w:color w:val="DC1414"/>
           <w:sz w:val="20"/>
         </w:rPr>
-        <w:t>한편 동일한 대응 비교에서 각 클래스는 자신의 프로토타입 방향으로 이동하는 동시에 상대 클래스 프로토타입 방향으로도 일부 이동하였다. 이는 코사인 점수가 클래스와의 절대적 거리보다 상대적 위치를 반영한다는 점을 시사한다. Δscore는 두 점수의 차이로 정의되는 보조 지표로만 소개하며, 본 연구의 논지는 HCC cosine score에 둔다.</w:t>
+        <w:t>한편 동일한 대응 비교에서 각 클래스는 자신의 프로토타입 방향으로 이동하는 동시에 상대 클래스 프로토타입 방향으로도 일부 이동하였다. 이는 코사인 점수가 두 클래스 사이의 상대적 위치를 반영한다는 점을 시사한다. Δscore는 두 점수의 차이로 정의되는 보조 지표로만 소개하며, 본 연구의 논지는 HCC cosine score에 둔다.</w:t>
       </w:r>
     </w:p>
     <w:p>

</xml_diff>